<commit_message>
Revisión U12: numeración, tablas CE, snippets HSRP y erratas
</commit_message>
<xml_diff>
--- a/docx/12-alta-disponibilidad/12-alta-disponibilidad.docx
+++ b/docx/12-alta-disponibilidad/12-alta-disponibilidad.docx
@@ -66,7 +66,7 @@
         <w:t xml:space="preserve"> </w:t>
       </w:r>
       <w:r>
-        <w:t xml:space="preserve">🌐 NAT → 🛡️ ACLs →</w:t>
+        <w:t xml:space="preserve">🛡️ ACLs → 📶 WiFi →</w:t>
       </w:r>
       <w:r>
         <w:t xml:space="preserve"> </w:t>
@@ -1103,7 +1103,7 @@
         <w:pStyle w:val="Heading1"/>
       </w:pPr>
       <w:r>
-        <w:t xml:space="preserve">01 — Disponibilidad y SPOFs</w:t>
+        <w:t xml:space="preserve">1 — Disponibilidad y SPOFs</w:t>
       </w:r>
     </w:p>
     <w:p>
@@ -1151,7 +1151,7 @@
         <w:t xml:space="preserve"> </w:t>
       </w:r>
       <w:r>
-        <w:t xml:space="preserve">→ 01 · Disponibilidad y SPOFs</w:t>
+        <w:t xml:space="preserve">→ 1 · Disponibilidad y SPOFs</w:t>
       </w:r>
     </w:p>
     <w:p>
@@ -2999,7 +2999,7 @@
           <w:rPr>
             <w:rStyle w:val="Hyperlink"/>
           </w:rPr>
-          <w:t xml:space="preserve">02 · STP: redundancia sin bucles</w:t>
+          <w:t xml:space="preserve">2 · STP: redundancia sin bucles</w:t>
         </w:r>
       </w:hyperlink>
     </w:p>
@@ -3011,7 +3011,7 @@
         <w:pStyle w:val="Heading1"/>
       </w:pPr>
       <w:r>
-        <w:t xml:space="preserve">02 — STP: redundancia sin bucles</w:t>
+        <w:t xml:space="preserve">1 — STP: redundancia sin bucles</w:t>
       </w:r>
     </w:p>
     <w:p>
@@ -3059,7 +3059,7 @@
         <w:t xml:space="preserve"> </w:t>
       </w:r>
       <w:r>
-        <w:t xml:space="preserve">→ 02 · STP: redundancia sin bucles</w:t>
+        <w:t xml:space="preserve">→ 1 · STP: redundancia sin bucles</w:t>
       </w:r>
     </w:p>
     <w:p>
@@ -4396,7 +4396,7 @@
           <w:rPr>
             <w:rStyle w:val="Hyperlink"/>
           </w:rPr>
-          <w:t xml:space="preserve">01 · Disponibilidad y SPOFs</w:t>
+          <w:t xml:space="preserve">1 · Disponibilidad y SPOFs</w:t>
         </w:r>
       </w:hyperlink>
       <w:r>
@@ -4423,7 +4423,7 @@
           <w:rPr>
             <w:rStyle w:val="Hyperlink"/>
           </w:rPr>
-          <w:t xml:space="preserve">03 · EtherChannel</w:t>
+          <w:t xml:space="preserve">3 · EtherChannel</w:t>
         </w:r>
       </w:hyperlink>
     </w:p>
@@ -4435,7 +4435,7 @@
         <w:pStyle w:val="Heading1"/>
       </w:pPr>
       <w:r>
-        <w:t xml:space="preserve">03 — EtherChannel</w:t>
+        <w:t xml:space="preserve">3 — EtherChannel</w:t>
       </w:r>
     </w:p>
     <w:p>
@@ -4483,7 +4483,7 @@
         <w:t xml:space="preserve"> </w:t>
       </w:r>
       <w:r>
-        <w:t xml:space="preserve">→ 03 · EtherChannel</w:t>
+        <w:t xml:space="preserve">→ 3 · EtherChannel</w:t>
       </w:r>
     </w:p>
     <w:p>
@@ -6096,10 +6096,7 @@
         <w:t xml:space="preserve">(P)</w:t>
       </w:r>
       <w:r>
-        <w:t xml:space="preserve">: canal</w:t>
-      </w:r>
-      <w:r>
-        <w:t xml:space="preserve"> </w:t>
+        <w:t xml:space="preserve">: canal en uso (</w:t>
       </w:r>
       <w:r>
         <w:rPr>
@@ -6109,7 +6106,39 @@
         <w:t xml:space="preserve">S</w:t>
       </w:r>
       <w:r>
-        <w:t xml:space="preserve">tanding/usable (en uso) con miembros activos en el canal.</w:t>
+        <w:t xml:space="preserve"> </w:t>
+      </w:r>
+      <w:r>
+        <w:t xml:space="preserve">= capa 2,</w:t>
+      </w:r>
+      <w:r>
+        <w:t xml:space="preserve"> </w:t>
+      </w:r>
+      <w:r>
+        <w:rPr>
+          <w:b/>
+          <w:bCs/>
+        </w:rPr>
+        <w:t xml:space="preserve">U</w:t>
+      </w:r>
+      <w:r>
+        <w:t xml:space="preserve"> </w:t>
+      </w:r>
+      <w:r>
+        <w:t xml:space="preserve">=</w:t>
+      </w:r>
+      <w:r>
+        <w:t xml:space="preserve"> </w:t>
+      </w:r>
+      <w:r>
+        <w:rPr>
+          <w:i/>
+          <w:iCs/>
+        </w:rPr>
+        <w:t xml:space="preserve">in use</w:t>
+      </w:r>
+      <w:r>
+        <w:t xml:space="preserve">) con miembros activos en el canal.</w:t>
       </w:r>
       <w:r>
         <w:t xml:space="preserve"> </w:t>
@@ -6501,7 +6530,7 @@
           <w:rPr>
             <w:rStyle w:val="Hyperlink"/>
           </w:rPr>
-          <w:t xml:space="preserve">02 · STP: redundancia sin bucles</w:t>
+          <w:t xml:space="preserve">2 · STP: redundancia sin bucles</w:t>
         </w:r>
       </w:hyperlink>
       <w:r>
@@ -6528,7 +6557,7 @@
           <w:rPr>
             <w:rStyle w:val="Hyperlink"/>
           </w:rPr>
-          <w:t xml:space="preserve">04 · Stacking y chassis virtuales</w:t>
+          <w:t xml:space="preserve">4 · Stacking y chassis virtuales</w:t>
         </w:r>
       </w:hyperlink>
     </w:p>
@@ -6540,7 +6569,7 @@
         <w:pStyle w:val="Heading1"/>
       </w:pPr>
       <w:r>
-        <w:t xml:space="preserve">04 — Stacking y chassis virtuales</w:t>
+        <w:t xml:space="preserve">4 — Stacking y chassis virtuales</w:t>
       </w:r>
     </w:p>
     <w:p>
@@ -6588,7 +6617,7 @@
         <w:t xml:space="preserve"> </w:t>
       </w:r>
       <w:r>
-        <w:t xml:space="preserve">→ 04 · Stacking y chassis virtuales</w:t>
+        <w:t xml:space="preserve">→ 4 · Stacking y chassis virtuales</w:t>
       </w:r>
     </w:p>
     <w:p>
@@ -7049,7 +7078,7 @@
                 <w:b/>
                 <w:bCs/>
               </w:rPr>
-              <w:t xml:space="preserve">StackWise / VSS / MLag</w:t>
+              <w:t xml:space="preserve">StackWise / VSS / MLAG</w:t>
             </w:r>
           </w:p>
         </w:tc>
@@ -7787,7 +7816,7 @@
         <w:t xml:space="preserve"> </w:t>
       </w:r>
       <w:r>
-        <w:t xml:space="preserve">— ¿Y cómo los gestionas? ¿Dos IPs, dos configuraciones, dos veces el mismo error de VLAN? ¿Y qué pasa cuando STP decide bloquear el uplink del de abajo por el camino que tu neither-probaste? ¿Y el gateway: quién lo sirve, el router con dos cables?</w:t>
+        <w:t xml:space="preserve">— ¿Y cómo los gestionas? ¿Dos IPs, dos configuraciones, dos veces el mismo error de VLAN? ¿Y qué pasa cuando STP decide bloquear el uplink del de abajo por el camino que nunca probaste? ¿Y el gateway: quién lo sirve, el router con dos cables?</w:t>
       </w:r>
     </w:p>
     <w:p>
@@ -8354,7 +8383,7 @@
           <w:rPr>
             <w:rStyle w:val="Hyperlink"/>
           </w:rPr>
-          <w:t xml:space="preserve">03 · EtherChannel</w:t>
+          <w:t xml:space="preserve">3 · EtherChannel</w:t>
         </w:r>
       </w:hyperlink>
       <w:r>
@@ -8381,7 +8410,7 @@
           <w:rPr>
             <w:rStyle w:val="Hyperlink"/>
           </w:rPr>
-          <w:t xml:space="preserve">05 · FHRP: el gateway redundante</w:t>
+          <w:t xml:space="preserve">5 · FHRP: el gateway redundante</w:t>
         </w:r>
       </w:hyperlink>
     </w:p>
@@ -8393,7 +8422,7 @@
         <w:pStyle w:val="Heading1"/>
       </w:pPr>
       <w:r>
-        <w:t xml:space="preserve">05 — FHRP: el gateway redundante</w:t>
+        <w:t xml:space="preserve">5 — FHRP: el gateway redundante</w:t>
       </w:r>
     </w:p>
     <w:p>
@@ -8441,7 +8470,7 @@
         <w:t xml:space="preserve"> </w:t>
       </w:r>
       <w:r>
-        <w:t xml:space="preserve">→ 05 · FHRP: el gateway redundante</w:t>
+        <w:t xml:space="preserve">→ 5 · FHRP: el gateway redundante</w:t>
       </w:r>
     </w:p>
     <w:p>
@@ -10125,7 +10154,7 @@
           <w:rPr>
             <w:rStyle w:val="Hyperlink"/>
           </w:rPr>
-          <w:t xml:space="preserve">04 · Stacking y chassis virtuales</w:t>
+          <w:t xml:space="preserve">4 · Stacking y chassis virtuales</w:t>
         </w:r>
       </w:hyperlink>
       <w:r>
@@ -10152,7 +10181,7 @@
           <w:rPr>
             <w:rStyle w:val="Hyperlink"/>
           </w:rPr>
-          <w:t xml:space="preserve">06 · HSRP en Cisco</w:t>
+          <w:t xml:space="preserve">6 · HSRP en Cisco</w:t>
         </w:r>
       </w:hyperlink>
     </w:p>
@@ -10164,7 +10193,7 @@
         <w:pStyle w:val="Heading1"/>
       </w:pPr>
       <w:r>
-        <w:t xml:space="preserve">06 — HSRP en Cisco</w:t>
+        <w:t xml:space="preserve">6 — HSRP en Cisco</w:t>
       </w:r>
     </w:p>
     <w:p>
@@ -10212,7 +10241,7 @@
         <w:t xml:space="preserve"> </w:t>
       </w:r>
       <w:r>
-        <w:t xml:space="preserve">→ 06 · HSRP en Cisco</w:t>
+        <w:t xml:space="preserve">→ 6 · HSRP en Cisco</w:t>
       </w:r>
     </w:p>
     <w:p>
@@ -10847,6 +10876,24 @@
         <w:rPr>
           <w:rStyle w:val="VerbatimChar"/>
         </w:rPr>
+        <w:t xml:space="preserve">R1(config-subif)# encapsulation dot1Q 10</w:t>
+      </w:r>
+      <w:r>
+        <w:br/>
+      </w:r>
+      <w:r>
+        <w:rPr>
+          <w:rStyle w:val="VerbatimChar"/>
+        </w:rPr>
+        <w:t xml:space="preserve">R1(config-subif)# ip address 192.168.10.2 255.255.255.0</w:t>
+      </w:r>
+      <w:r>
+        <w:br/>
+      </w:r>
+      <w:r>
+        <w:rPr>
+          <w:rStyle w:val="VerbatimChar"/>
+        </w:rPr>
         <w:t xml:space="preserve">R1(config-subif)# standby 1 ip 192.168.10.1</w:t>
       </w:r>
       <w:r>
@@ -10875,6 +10922,24 @@
           <w:rStyle w:val="VerbatimChar"/>
         </w:rPr>
         <w:t xml:space="preserve">R1(config)# interface gig 0/0.20</w:t>
+      </w:r>
+      <w:r>
+        <w:br/>
+      </w:r>
+      <w:r>
+        <w:rPr>
+          <w:rStyle w:val="VerbatimChar"/>
+        </w:rPr>
+        <w:t xml:space="preserve">R1(config-subif)# encapsulation dot1Q 20</w:t>
+      </w:r>
+      <w:r>
+        <w:br/>
+      </w:r>
+      <w:r>
+        <w:rPr>
+          <w:rStyle w:val="VerbatimChar"/>
+        </w:rPr>
+        <w:t xml:space="preserve">R1(config-subif)# ip address 192.168.20.2 255.255.255.0</w:t>
       </w:r>
       <w:r>
         <w:br/>
@@ -10937,7 +11002,7 @@
         <w:rPr>
           <w:rStyle w:val="VerbatimChar"/>
         </w:rPr>
-        <w:t xml:space="preserve">             P   Active        Standby       Virtual IP</w:t>
+        <w:t xml:space="preserve">             Interface   Grp  Pri  P State   Active        Standby       Virtual IP</w:t>
       </w:r>
       <w:r>
         <w:br/>
@@ -10946,7 +11011,7 @@
         <w:rPr>
           <w:rStyle w:val="VerbatimChar"/>
         </w:rPr>
-        <w:t xml:space="preserve">Gi0/0        110 Active        192.168.1.3   192.168.1.1</w:t>
+        <w:t xml:space="preserve">             Gi0/0       1    110  Y Active  local         192.168.1.3   192.168.1.1</w:t>
       </w:r>
     </w:p>
     <w:p>
@@ -11868,7 +11933,7 @@
           <w:rPr>
             <w:rStyle w:val="Hyperlink"/>
           </w:rPr>
-          <w:t xml:space="preserve">05 · FHRP: el gateway redundante</w:t>
+          <w:t xml:space="preserve">5 · FHRP: el gateway redundante</w:t>
         </w:r>
       </w:hyperlink>
       <w:r>
@@ -11895,7 +11960,7 @@
           <w:rPr>
             <w:rStyle w:val="Hyperlink"/>
           </w:rPr>
-          <w:t xml:space="preserve">07 · Redundancia en capa 3</w:t>
+          <w:t xml:space="preserve">7 · Redundancia en capa 3</w:t>
         </w:r>
       </w:hyperlink>
     </w:p>
@@ -11907,7 +11972,7 @@
         <w:pStyle w:val="Heading1"/>
       </w:pPr>
       <w:r>
-        <w:t xml:space="preserve">07 — Redundancia en capa 3</w:t>
+        <w:t xml:space="preserve">7 — Redundancia en capa 3</w:t>
       </w:r>
     </w:p>
     <w:p>
@@ -11955,7 +12020,7 @@
         <w:t xml:space="preserve"> </w:t>
       </w:r>
       <w:r>
-        <w:t xml:space="preserve">→ 07 · Redundancia en capa 3</w:t>
+        <w:t xml:space="preserve">→ 7 · Redundancia en capa 3</w:t>
       </w:r>
     </w:p>
     <w:p>
@@ -13720,7 +13785,7 @@
           <w:rPr>
             <w:rStyle w:val="Hyperlink"/>
           </w:rPr>
-          <w:t xml:space="preserve">06 · HSRP en Cisco</w:t>
+          <w:t xml:space="preserve">6 · HSRP en Cisco</w:t>
         </w:r>
       </w:hyperlink>
       <w:r>
@@ -13747,7 +13812,7 @@
           <w:rPr>
             <w:rStyle w:val="Hyperlink"/>
           </w:rPr>
-          <w:t xml:space="preserve">08 · Plan de continuidad</w:t>
+          <w:t xml:space="preserve">8 · Plan de continuidad</w:t>
         </w:r>
       </w:hyperlink>
     </w:p>
@@ -13759,7 +13824,7 @@
         <w:pStyle w:val="Heading1"/>
       </w:pPr>
       <w:r>
-        <w:t xml:space="preserve">08 — Plan de continuidad</w:t>
+        <w:t xml:space="preserve">8 — Plan de continuidad</w:t>
       </w:r>
     </w:p>
     <w:p>
@@ -13807,7 +13872,7 @@
         <w:t xml:space="preserve"> </w:t>
       </w:r>
       <w:r>
-        <w:t xml:space="preserve">→ 08 · Plan de continuidad</w:t>
+        <w:t xml:space="preserve">→ 8 · Plan de continuidad</w:t>
       </w:r>
     </w:p>
     <w:p>
@@ -15490,7 +15555,7 @@
           <w:rPr>
             <w:rStyle w:val="Hyperlink"/>
           </w:rPr>
-          <w:t xml:space="preserve">07 · Redundancia en capa 3</w:t>
+          <w:t xml:space="preserve">7 · Redundancia en capa 3</w:t>
         </w:r>
       </w:hyperlink>
       <w:r>
@@ -15517,7 +15582,7 @@
           <w:rPr>
             <w:rStyle w:val="Hyperlink"/>
           </w:rPr>
-          <w:t xml:space="preserve">09 · Cierre</w:t>
+          <w:t xml:space="preserve">9 · Cierre</w:t>
         </w:r>
       </w:hyperlink>
     </w:p>
@@ -16517,7 +16582,7 @@
         <w:rPr>
           <w:rStyle w:val="VerbatimChar"/>
         </w:rPr>
-        <w:t xml:space="preserve">standby timers 1 3</w:t>
+        <w:t xml:space="preserve">standby 1 timers 1 3</w:t>
       </w:r>
       <w:r>
         <w:t xml:space="preserve"> </w:t>
@@ -17029,7 +17094,7 @@
         <w:rPr>
           <w:rStyle w:val="VerbatimChar"/>
         </w:rPr>
-        <w:t xml:space="preserve">5. Agrupación de enlaces físicos en uno lógico (dos palabras)</w:t>
+        <w:t xml:space="preserve">5. Agrupación de enlaces físicos en uno lógico</w:t>
       </w:r>
       <w:r>
         <w:br/>
@@ -17077,7 +17142,7 @@
         <w:rPr>
           <w:rStyle w:val="VerbatimChar"/>
         </w:rPr>
-        <w:t xml:space="preserve">6. Varios switches convertidos en uno lógico (2 palabras)</w:t>
+        <w:t xml:space="preserve">6. Varios switches convertidos en uno lógico</w:t>
       </w:r>
     </w:p>
     <w:p>
@@ -17603,18 +17668,18 @@
               <w:pStyle w:val="Compact"/>
             </w:pPr>
             <w:r>
-              <w:t xml:space="preserve">Conmutadores con tolerancia a fallos</w:t>
-            </w:r>
-          </w:p>
-        </w:tc>
-        <w:tc>
-          <w:tcPr/>
-          <w:p>
-            <w:pPr>
-              <w:pStyle w:val="Compact"/>
-            </w:pPr>
-            <w:r>
-              <w:t xml:space="preserve">✅ Puntos 2-4 y ⚡ Laboratorio</w:t>
+              <w:t xml:space="preserve">Administración de conmutadores con tolerancia a fallos</w:t>
+            </w:r>
+          </w:p>
+        </w:tc>
+        <w:tc>
+          <w:tcPr/>
+          <w:p>
+            <w:pPr>
+              <w:pStyle w:val="Compact"/>
+            </w:pPr>
+            <w:r>
+              <w:t xml:space="preserve">✅ Puntos 2, 3 y 4 + ⚡ Laboratorio (punto 9)</w:t>
             </w:r>
           </w:p>
         </w:tc>
@@ -17638,7 +17703,7 @@
               <w:pStyle w:val="Compact"/>
             </w:pPr>
             <w:r>
-              <w:t xml:space="preserve">Segmentación con continuidad de servicio</w:t>
+              <w:t xml:space="preserve">Segmentación segura y continua de la red</w:t>
             </w:r>
           </w:p>
         </w:tc>
@@ -17673,18 +17738,18 @@
               <w:pStyle w:val="Compact"/>
             </w:pPr>
             <w:r>
-              <w:t xml:space="preserve">Encaminamiento redundante</w:t>
-            </w:r>
-          </w:p>
-        </w:tc>
-        <w:tc>
-          <w:tcPr/>
-          <w:p>
-            <w:pPr>
-              <w:pStyle w:val="Compact"/>
-            </w:pPr>
-            <w:r>
-              <w:t xml:space="preserve">✅ Puntos 5-7 + 🧠 Atrévete (punto 9)</w:t>
+              <w:t xml:space="preserve">Encaminamiento con redundancia</w:t>
+            </w:r>
+          </w:p>
+        </w:tc>
+        <w:tc>
+          <w:tcPr/>
+          <w:p>
+            <w:pPr>
+              <w:pStyle w:val="Compact"/>
+            </w:pPr>
+            <w:r>
+              <w:t xml:space="preserve">✅ Puntos 5, 6 y 7 + 🧠 Atrévete a pensar (punto 9)</w:t>
             </w:r>
           </w:p>
         </w:tc>
@@ -17708,7 +17773,7 @@
               <w:pStyle w:val="Compact"/>
             </w:pPr>
             <w:r>
-              <w:t xml:space="preserve">Estructura y principios de redes tolerantes</w:t>
+              <w:t xml:space="preserve">Estructura de red tolerante a fallos</w:t>
             </w:r>
           </w:p>
         </w:tc>

</xml_diff>